<commit_message>
Modified one pager to fit requirements better
</commit_message>
<xml_diff>
--- a/OnePager.docx
+++ b/OnePager.docx
@@ -61,7 +61,21 @@
         <w:rPr>
           <w:rFonts w:ascii="Times New Roman" w:hAnsi="Times New Roman" w:cs="Times New Roman"/>
         </w:rPr>
-        <w:t>This one pager describes 3</w:t>
+        <w:t xml:space="preserve">This one </w:t>
+      </w:r>
+      <w:proofErr w:type="gramStart"/>
+      <w:r>
+        <w:rPr>
+          <w:rFonts w:ascii="Times New Roman" w:hAnsi="Times New Roman" w:cs="Times New Roman"/>
+        </w:rPr>
+        <w:t>pager</w:t>
+      </w:r>
+      <w:proofErr w:type="gramEnd"/>
+      <w:r>
+        <w:rPr>
+          <w:rFonts w:ascii="Times New Roman" w:hAnsi="Times New Roman" w:cs="Times New Roman"/>
+        </w:rPr>
+        <w:t xml:space="preserve"> describes 3</w:t>
       </w:r>
       <w:r>
         <w:rPr>
@@ -73,19 +87,47 @@
         <w:rPr>
           <w:rFonts w:ascii="Times New Roman" w:hAnsi="Times New Roman" w:cs="Times New Roman"/>
         </w:rPr>
-        <w:t>These principles are d</w:t>
-      </w:r>
-      <w:r>
-        <w:rPr>
-          <w:rFonts w:ascii="Times New Roman" w:hAnsi="Times New Roman" w:cs="Times New Roman"/>
-        </w:rPr>
-        <w:t>esign your game around a core mechanic</w:t>
-      </w:r>
-      <w:r>
-        <w:rPr>
-          <w:rFonts w:ascii="Times New Roman" w:hAnsi="Times New Roman" w:cs="Times New Roman"/>
-        </w:rPr>
-        <w:t>, fair challenge vs frustration, and teach without teaching.</w:t>
+        <w:t xml:space="preserve">These principles are </w:t>
+      </w:r>
+      <w:proofErr w:type="gramStart"/>
+      <w:r>
+        <w:rPr>
+          <w:rFonts w:ascii="Times New Roman" w:hAnsi="Times New Roman" w:cs="Times New Roman"/>
+        </w:rPr>
+        <w:t>d</w:t>
+      </w:r>
+      <w:r>
+        <w:rPr>
+          <w:rFonts w:ascii="Times New Roman" w:hAnsi="Times New Roman" w:cs="Times New Roman"/>
+        </w:rPr>
+        <w:t>esign</w:t>
+      </w:r>
+      <w:proofErr w:type="gramEnd"/>
+      <w:r>
+        <w:rPr>
+          <w:rFonts w:ascii="Times New Roman" w:hAnsi="Times New Roman" w:cs="Times New Roman"/>
+        </w:rPr>
+        <w:t xml:space="preserve"> your game around a core mechanic</w:t>
+      </w:r>
+      <w:r>
+        <w:rPr>
+          <w:rFonts w:ascii="Times New Roman" w:hAnsi="Times New Roman" w:cs="Times New Roman"/>
+        </w:rPr>
+        <w:t xml:space="preserve">, fair challenge vs frustration, and </w:t>
+      </w:r>
+      <w:proofErr w:type="gramStart"/>
+      <w:r>
+        <w:rPr>
+          <w:rFonts w:ascii="Times New Roman" w:hAnsi="Times New Roman" w:cs="Times New Roman"/>
+        </w:rPr>
+        <w:t>teach</w:t>
+      </w:r>
+      <w:proofErr w:type="gramEnd"/>
+      <w:r>
+        <w:rPr>
+          <w:rFonts w:ascii="Times New Roman" w:hAnsi="Times New Roman" w:cs="Times New Roman"/>
+        </w:rPr>
+        <w:t xml:space="preserve"> without teaching.</w:t>
       </w:r>
     </w:p>
     <w:p>
@@ -119,12 +161,6 @@
         <w:rPr>
           <w:rFonts w:ascii="Times New Roman" w:hAnsi="Times New Roman" w:cs="Times New Roman"/>
         </w:rPr>
-        <w:t xml:space="preserve">The primary use of this principle is to choose a simple core mechanic, which you then build all the other elements of your game around. </w:t>
-      </w:r>
-      <w:r>
-        <w:rPr>
-          <w:rFonts w:ascii="Times New Roman" w:hAnsi="Times New Roman" w:cs="Times New Roman"/>
-        </w:rPr>
         <w:t xml:space="preserve">A game that </w:t>
       </w:r>
       <w:r>
@@ -143,7 +179,27 @@
         <w:rPr>
           <w:rFonts w:ascii="Times New Roman" w:hAnsi="Times New Roman" w:cs="Times New Roman"/>
         </w:rPr>
-        <w:t>The pros are it allows your game to feel more cohesive and easier to understand, while the cons are it can limit what you’re able to do as you have to stay close to your core mechanic.</w:t>
+        <w:t xml:space="preserve">The pros are it allows your game to feel more cohesive and easier to understand, while the cons are it can limit what you’re able to do as you </w:t>
+      </w:r>
+      <w:proofErr w:type="gramStart"/>
+      <w:r>
+        <w:rPr>
+          <w:rFonts w:ascii="Times New Roman" w:hAnsi="Times New Roman" w:cs="Times New Roman"/>
+        </w:rPr>
+        <w:t>have to</w:t>
+      </w:r>
+      <w:proofErr w:type="gramEnd"/>
+      <w:r>
+        <w:rPr>
+          <w:rFonts w:ascii="Times New Roman" w:hAnsi="Times New Roman" w:cs="Times New Roman"/>
+        </w:rPr>
+        <w:t xml:space="preserve"> stay close to your core mechanic.</w:t>
+      </w:r>
+      <w:r>
+        <w:rPr>
+          <w:rFonts w:ascii="Times New Roman" w:hAnsi="Times New Roman" w:cs="Times New Roman"/>
+        </w:rPr>
+        <w:t xml:space="preserve"> I may use this principle, depending on if the idea I decide on is centered around a specific mechanic, or not if the idea is more general.</w:t>
       </w:r>
     </w:p>
     <w:p>
@@ -177,13 +233,13 @@
         <w:rPr>
           <w:rFonts w:ascii="Times New Roman" w:hAnsi="Times New Roman" w:cs="Times New Roman"/>
         </w:rPr>
-        <w:t>This principle is the practice of balancing the difficulty of a game, so that it isn’t too easy, while it also doesn’t feel unfair to the player</w:t>
-      </w:r>
-      <w:r>
-        <w:rPr>
-          <w:rFonts w:ascii="Times New Roman" w:hAnsi="Times New Roman" w:cs="Times New Roman"/>
-        </w:rPr>
-        <w:t xml:space="preserve">. An example of this is Elden Ring, which despite having a rather high difficulty, gives the player many ways to get stronger or make things easier, and the bosses are well made to ensure that as much as possible your death is your own fault, rather than the game’s. Pros are balanced difficulty allows more people to be able to play a game, cons are this may be difficult to execute as difficulty is very subjective, and if trying to make a game anyone can play it would likely result in a game which is too easy for many people. </w:t>
+        <w:t xml:space="preserve">An example of this is Elden Ring, which despite having a rather high difficulty, gives the player many ways to get stronger or make things easier, and the bosses are well made to ensure that as much as possible your death is your own fault, rather than the game’s. Pros are balanced difficulty allows more people to be able to play a game, cons are this may be difficult to execute as difficulty is very subjective, and if trying to make a game anyone can play it would likely result in a game which is too easy for many people. </w:t>
+      </w:r>
+      <w:r>
+        <w:rPr>
+          <w:rFonts w:ascii="Times New Roman" w:hAnsi="Times New Roman" w:cs="Times New Roman"/>
+        </w:rPr>
+        <w:t>I will use this principle in balancing my game, to ensure that it remains difficult but still fun and enjoyable.</w:t>
       </w:r>
     </w:p>
     <w:p>
@@ -197,7 +253,14 @@
         <w:rPr>
           <w:rFonts w:ascii="Times New Roman" w:hAnsi="Times New Roman" w:cs="Times New Roman"/>
         </w:rPr>
-        <w:t>Teach without teaching</w:t>
+        <w:t xml:space="preserve">Teach without </w:t>
+      </w:r>
+      <w:proofErr w:type="gramStart"/>
+      <w:r>
+        <w:rPr>
+          <w:rFonts w:ascii="Times New Roman" w:hAnsi="Times New Roman" w:cs="Times New Roman"/>
+        </w:rPr>
+        <w:t>teaching</w:t>
       </w:r>
       <w:r>
         <w:rPr>
@@ -206,6 +269,7 @@
         </w:rPr>
         <w:t>3</w:t>
       </w:r>
+      <w:proofErr w:type="gramEnd"/>
     </w:p>
     <w:p>
       <w:pPr>
@@ -217,25 +281,33 @@
         <w:rPr>
           <w:rFonts w:ascii="Times New Roman" w:hAnsi="Times New Roman" w:cs="Times New Roman"/>
         </w:rPr>
-        <w:t>The primary use of this principle is</w:t>
-      </w:r>
-      <w:r>
-        <w:rPr>
-          <w:rFonts w:ascii="Times New Roman" w:hAnsi="Times New Roman" w:cs="Times New Roman"/>
-        </w:rPr>
-        <w:t xml:space="preserve">, rather than directly explaining a new mechanic to the player, building the game so that it guides the player to learn how it works through </w:t>
-      </w:r>
-      <w:r>
-        <w:rPr>
-          <w:rFonts w:ascii="Times New Roman" w:hAnsi="Times New Roman" w:cs="Times New Roman"/>
-        </w:rPr>
-        <w:t>using it. A game that has this principle is The Witness, which explains nothing to the player, using puzzles with slowly escalating mechanics to allow them to learn how a given mechanic works by playing.</w:t>
-      </w:r>
-      <w:r>
-        <w:rPr>
-          <w:rFonts w:ascii="Times New Roman" w:hAnsi="Times New Roman" w:cs="Times New Roman"/>
-        </w:rPr>
-        <w:t xml:space="preserve"> Some pros of this principle is it allows the player to feel accomplishment from figuring the mechanic and avoid feeling talked down to by the game, while the cons are it’s possible the player could fail to figure out the mechanic or miss key details of it.</w:t>
+        <w:t>A game that has this principle is The Witness, which explains nothing to the player, using puzzles with slowly escalating mechanics to allow them to learn how a given mechanic works by playing.</w:t>
+      </w:r>
+      <w:r>
+        <w:rPr>
+          <w:rFonts w:ascii="Times New Roman" w:hAnsi="Times New Roman" w:cs="Times New Roman"/>
+        </w:rPr>
+        <w:t xml:space="preserve"> Some pros of this principle </w:t>
+      </w:r>
+      <w:proofErr w:type="gramStart"/>
+      <w:r>
+        <w:rPr>
+          <w:rFonts w:ascii="Times New Roman" w:hAnsi="Times New Roman" w:cs="Times New Roman"/>
+        </w:rPr>
+        <w:t>is</w:t>
+      </w:r>
+      <w:proofErr w:type="gramEnd"/>
+      <w:r>
+        <w:rPr>
+          <w:rFonts w:ascii="Times New Roman" w:hAnsi="Times New Roman" w:cs="Times New Roman"/>
+        </w:rPr>
+        <w:t xml:space="preserve"> it allows the player to feel accomplishment from figuring the mechanic and avoid feeling talked down to by the game, while the cons are it’s possible the player could fail to figure out the mechanic or miss key details of it.</w:t>
+      </w:r>
+      <w:r>
+        <w:rPr>
+          <w:rFonts w:ascii="Times New Roman" w:hAnsi="Times New Roman" w:cs="Times New Roman"/>
+        </w:rPr>
+        <w:t xml:space="preserve"> This principle will likely shape how I attempt to teach the player of my game, as I personally prefer when games teach without teaching, so I would like my game to do the same. </w:t>
       </w:r>
     </w:p>
     <w:p>
@@ -342,15 +414,7 @@
           <w:sz w:val="20"/>
           <w:szCs w:val="20"/>
         </w:rPr>
-        <w:t xml:space="preserve">3 </w:t>
-      </w:r>
-      <w:r>
-        <w:rPr>
-          <w:rFonts w:ascii="Times New Roman" w:hAnsi="Times New Roman" w:cs="Times New Roman"/>
-          <w:sz w:val="20"/>
-          <w:szCs w:val="20"/>
-        </w:rPr>
-        <w:t>Day 02 – Intro to Game Design class slides</w:t>
+        <w:t>3 Day 02 – Intro to Game Design class slides</w:t>
       </w:r>
     </w:p>
     <w:p>
@@ -368,15 +432,7 @@
           <w:sz w:val="20"/>
           <w:szCs w:val="20"/>
         </w:rPr>
-        <w:t xml:space="preserve">AI Usage: </w:t>
-      </w:r>
-      <w:r>
-        <w:rPr>
-          <w:rFonts w:ascii="Times New Roman" w:hAnsi="Times New Roman" w:cs="Times New Roman"/>
-          <w:sz w:val="20"/>
-          <w:szCs w:val="20"/>
-        </w:rPr>
-        <w:t>https://chatgpt.com/share/68e2ac63-9580-8009-b725-73487b72da75</w:t>
+        <w:t>AI Usage: https://chatgpt.com/share/68e2ac63-9580-8009-b725-73487b72da75</w:t>
       </w:r>
     </w:p>
     <w:sectPr>

</xml_diff>